<commit_message>
Trust document v0.3: add Aevah platform diagram (captioned as conceptual) after In brief; remove eyebrow line, per Jason [no-findings-change]
Co-Authored-By: Claude Opus 5.5 (1M context) <noreply@anthropic.com>
</commit_message>
<xml_diff>
--- a/docs/briefs/trust_document_v0.3/Aevah_How_Mo_Works_v0.3_2026-10-14.docx
+++ b/docs/briefs/trust_document_v0.3/Aevah_How_Mo_Works_v0.3_2026-10-14.docx
@@ -40,20 +40,7 @@
     </w:p>
     <w:p>
       <w:pPr>
-        <w:spacing w:before="360" w:after="40"/>
-      </w:pPr>
-      <w:r>
-        <w:rPr>
-          <w:b/>
-          <w:color w:val="77548E"/>
-          <w:sz w:val="17"/>
-        </w:rPr>
-        <w:t>TRUST DOCUMENT  ·  FOR BUILT</w:t>
-      </w:r>
-    </w:p>
-    <w:p>
-      <w:pPr>
-        <w:spacing w:after="80"/>
+        <w:spacing w:before="360" w:after="80"/>
       </w:pPr>
       <w:r>
         <w:rPr>
@@ -244,6 +231,56 @@
     </w:p>
     <w:p>
       <w:pPr>
+        <w:keepNext/>
+        <w:jc w:val="center"/>
+      </w:pPr>
+      <w:r>
+        <w:drawing>
+          <wp:inline xmlns:a="http://schemas.openxmlformats.org/drawingml/2006/main" xmlns:pic="http://schemas.openxmlformats.org/drawingml/2006/picture">
+            <wp:extent cx="6217920" cy="3497580"/>
+            <wp:docPr id="2" name="Picture 2"/>
+            <wp:cNvGraphicFramePr>
+              <a:graphicFrameLocks noChangeAspect="1"/>
+            </wp:cNvGraphicFramePr>
+            <a:graphic>
+              <a:graphicData uri="http://schemas.openxmlformats.org/drawingml/2006/picture">
+                <pic:pic>
+                  <pic:nvPicPr>
+                    <pic:cNvPr id="0" name="aevah_data_to_decisions.png"/>
+                    <pic:cNvPicPr/>
+                  </pic:nvPicPr>
+                  <pic:blipFill>
+                    <a:blip r:embed="rId11"/>
+                    <a:stretch>
+                      <a:fillRect/>
+                    </a:stretch>
+                  </pic:blipFill>
+                  <pic:spPr>
+                    <a:xfrm>
+                      <a:off x="0" y="0"/>
+                      <a:ext cx="6217920" cy="3497580"/>
+                    </a:xfrm>
+                    <a:prstGeom prst="rect"/>
+                  </pic:spPr>
+                </pic:pic>
+              </a:graphicData>
+            </a:graphic>
+          </wp:inline>
+        </w:drawing>
+      </w:r>
+    </w:p>
+    <w:p>
+      <w:r>
+        <w:rPr>
+          <w:i/>
+          <w:color w:val="625A69"/>
+          <w:sz w:val="17"/>
+        </w:rPr>
+        <w:t>How Aevah turns business data into decisions: a conceptual view of the Aevah platform, with illustrative data sources, models and experiences. The rest of this document describes the path Mo follows for BUILT today.</w:t>
+      </w:r>
+    </w:p>
+    <w:p>
+      <w:pPr>
         <w:pStyle w:val="Heading2"/>
         <w:keepNext/>
       </w:pPr>
@@ -268,7 +305,7 @@
         <w:drawing>
           <wp:inline xmlns:a="http://schemas.openxmlformats.org/drawingml/2006/main" xmlns:pic="http://schemas.openxmlformats.org/drawingml/2006/picture">
             <wp:extent cx="6217920" cy="1602606"/>
-            <wp:docPr id="2" name="Picture 2"/>
+            <wp:docPr id="3" name="Picture 3"/>
             <wp:cNvGraphicFramePr>
               <a:graphicFrameLocks noChangeAspect="1"/>
             </wp:cNvGraphicFramePr>
@@ -280,7 +317,7 @@
                     <pic:cNvPicPr/>
                   </pic:nvPicPr>
                   <pic:blipFill>
-                    <a:blip r:embed="rId11"/>
+                    <a:blip r:embed="rId12"/>
                     <a:stretch>
                       <a:fillRect/>
                     </a:stretch>

</xml_diff>

<commit_message>
Trust document v0.3: 'price sensitivity' renamed 'price elasticity' to match Mo's three analytics [no-findings-change]
Co-Authored-By: Claude Opus 5.5 (1M context) <noreply@anthropic.com>
</commit_message>
<xml_diff>
--- a/docs/briefs/trust_document_v0.3/Aevah_How_Mo_Works_v0.3_2026-10-14.docx
+++ b/docs/briefs/trust_document_v0.3/Aevah_How_Mo_Works_v0.3_2026-10-14.docx
@@ -94,7 +94,7 @@
           <w:b w:val="0"/>
           <w:i w:val="0"/>
         </w:rPr>
-        <w:t>Mo is BUILT's demand intelligence experience, built and operated by Aevah. It turns BUILT's retail sales data into forecasts, cannibalization reads, promotion and price reads, and retailer views that BUILT's teams can use directly.</w:t>
+        <w:t>Mo is BUILT's demand intelligence experience, built and operated by Aevah. It turns BUILT's retail sales data into demand forecasts, cannibalization and price elasticity, along with promotion reads and retailer views that BUILT's teams can use directly.</w:t>
       </w:r>
     </w:p>
     <w:p>
@@ -1130,7 +1130,7 @@
                 <w:color w:val="170A2A"/>
                 <w:sz w:val="19"/>
               </w:rPr>
-              <w:t>Price sensitivity</w:t>
+              <w:t>Price elasticity (how sales respond to price changes)</w:t>
             </w:r>
           </w:p>
         </w:tc>

</xml_diff>